<commit_message>
added week7 advisor meeting agenda and minutes
</commit_message>
<xml_diff>
--- a/Weekly Logs/Matt/Matt Baker - Week 7 Individual Logbook.docx
+++ b/Weekly Logs/Matt/Matt Baker - Week 7 Individual Logbook.docx
@@ -2569,14 +2569,23 @@
     </w:p>
     <w:p>
       <w:r>
-        <w:t>11:00-12:</w:t>
-      </w:r>
-      <w:r>
-        <w:t>15</w:t>
+        <w:t>11:00-</w:t>
+      </w:r>
+      <w:r>
+        <w:t>1</w:t>
+      </w:r>
+      <w:r>
+        <w:t>:</w:t>
+      </w:r>
+      <w:r>
+        <w:t>00</w:t>
       </w:r>
       <w:r>
         <w:t>AM</w:t>
       </w:r>
+      <w:r>
+        <w:t xml:space="preserve"> (1hr)</w:t>
+      </w:r>
     </w:p>
     <w:p>
       <w:r>
@@ -2606,6 +2615,9 @@
       <w:r>
         <w:t xml:space="preserve"> for the final group log before Olivia becomes the PM. </w:t>
       </w:r>
+      <w:r>
+        <w:t>I also audited my hours with Dave.</w:t>
+      </w:r>
     </w:p>
     <w:p>
       <w:pPr>
@@ -2626,6 +2638,9 @@
       <w:r>
         <w:t>10:00-11:00 AM</w:t>
       </w:r>
+      <w:r>
+        <w:t xml:space="preserve"> (1hr)</w:t>
+      </w:r>
     </w:p>
     <w:p>
       <w:r>
@@ -2661,6 +2676,57 @@
         <w:t>Documentation</w:t>
       </w:r>
       <w:bookmarkEnd w:id="6"/>
+    </w:p>
+    <w:p>
+      <w:r>
+        <w:t>Monday, August 24</w:t>
+      </w:r>
+    </w:p>
+    <w:p>
+      <w:r>
+        <w:t>1:00-1:</w:t>
+      </w:r>
+      <w:r>
+        <w:t>30</w:t>
+      </w:r>
+      <w:r>
+        <w:t xml:space="preserve"> PM</w:t>
+      </w:r>
+      <w:r>
+        <w:t xml:space="preserve"> (30 mins)</w:t>
+      </w:r>
+    </w:p>
+    <w:p>
+      <w:r>
+        <w:t>Created meeting agenda</w:t>
+      </w:r>
+      <w:r>
+        <w:t xml:space="preserve"> and meeting minutes</w:t>
+      </w:r>
+      <w:r>
+        <w:t xml:space="preserve"> template</w:t>
+      </w:r>
+      <w:r>
+        <w:t xml:space="preserve"> in </w:t>
+      </w:r>
+      <w:r>
+        <w:t>preparation</w:t>
+      </w:r>
+      <w:r>
+        <w:t xml:space="preserve"> for </w:t>
+      </w:r>
+      <w:r>
+        <w:t xml:space="preserve">our </w:t>
+      </w:r>
+      <w:r>
+        <w:t xml:space="preserve">meeting with Clement on </w:t>
+      </w:r>
+      <w:r>
+        <w:t>Wednesday</w:t>
+      </w:r>
+      <w:r>
+        <w:t>.</w:t>
+      </w:r>
     </w:p>
     <w:p>
       <w:pPr>

</xml_diff>

<commit_message>
updated logs, added individual conflict of interest statement
</commit_message>
<xml_diff>
--- a/Weekly Logs/Matt/Matt Baker - Week 7 Individual Logbook.docx
+++ b/Weekly Logs/Matt/Matt Baker - Week 7 Individual Logbook.docx
@@ -578,7 +578,7 @@
                   </wp:anchor>
                 </w:drawing>
               </mc:Choice>
-              <mc:Fallback xmlns:w16cei="http://schemas.microsoft.com/office/word/2026/wordml/cei">
+              <mc:Fallback>
                 <w:pict>
                   <v:shapetype w14:anchorId="759C119D" id="_x0000_t202" coordsize="21600,21600" o:spt="202" path="m,l,21600r21600,l21600,xe">
                     <v:stroke joinstyle="miter"/>
@@ -798,7 +798,7 @@
                   </wp:anchor>
                 </w:drawing>
               </mc:Choice>
-              <mc:Fallback xmlns:w16cei="http://schemas.microsoft.com/office/word/2026/wordml/cei">
+              <mc:Fallback>
                 <w:pict>
                   <v:rect w14:anchorId="2075F130" id="Rectangle 130" o:spid="_x0000_s1030" style="position:absolute;margin-left:-4.4pt;margin-top:0;width:46.8pt;height:77.75pt;z-index:251660288;visibility:visible;mso-wrap-style:square;mso-width-percent:76;mso-height-percent:98;mso-top-percent:23;mso-wrap-distance-left:9pt;mso-wrap-distance-top:0;mso-wrap-distance-right:9pt;mso-wrap-distance-bottom:0;mso-position-horizontal:right;mso-position-horizontal-relative:margin;mso-position-vertical-relative:page;mso-width-percent:76;mso-height-percent:98;mso-top-percent:23;mso-width-relative:page;mso-height-relative:page;v-text-anchor:bottom" o:gfxdata="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" fillcolor="#156082 [3204]" stroked="f" strokeweight="1.5pt">
                     <o:lock v:ext="edit" aspectratio="t"/>
@@ -2620,6 +2620,63 @@
       </w:r>
     </w:p>
     <w:p>
+      <w:r>
+        <w:t>Tuesday. August 25</w:t>
+      </w:r>
+    </w:p>
+    <w:p>
+      <w:r>
+        <w:t>10:00-11:30</w:t>
+      </w:r>
+      <w:r>
+        <w:t xml:space="preserve"> (1hr 30mins)</w:t>
+      </w:r>
+    </w:p>
+    <w:p>
+      <w:r>
+        <w:t xml:space="preserve">Team meeting with everyone </w:t>
+      </w:r>
+      <w:proofErr w:type="gramStart"/>
+      <w:r>
+        <w:t>present</w:t>
+      </w:r>
+      <w:proofErr w:type="gramEnd"/>
+      <w:r>
+        <w:t>, we established the meeting, came up with some tasks and roles Dave can fit into, specifically as a test case writer, he is to do research on this</w:t>
+      </w:r>
+      <w:r>
+        <w:t xml:space="preserve"> also. We discussed the meeting happening with clement tomorrow, how we are to contact him. I described the agenda and who is heading each topic in that meeting. We complete auditing for the rest of the group logs and discuss why </w:t>
+      </w:r>
+      <w:r>
+        <w:t>Dave</w:t>
+      </w:r>
+      <w:r>
+        <w:t xml:space="preserve"> will continue maintain the group logs going forward. I pulled up the BHB proposal feedback document and systematically, with the team, crossed off everything that we have considered done. For incomplete requirements, I highlighted them and assigned a person to work on that task. We then made sure everyone knew what they were doing today.</w:t>
+      </w:r>
+    </w:p>
+    <w:p>
+      <w:r>
+        <w:t>12:15 – 2:00</w:t>
+      </w:r>
+      <w:r>
+        <w:t xml:space="preserve"> PM</w:t>
+      </w:r>
+    </w:p>
+    <w:p>
+      <w:r>
+        <w:t>Debrief</w:t>
+      </w:r>
+      <w:r>
+        <w:t xml:space="preserve"> with the team on the meeting with Bryce, </w:t>
+      </w:r>
+      <w:r>
+        <w:t>assigning tasks to team</w:t>
+      </w:r>
+      <w:r>
+        <w:t xml:space="preserve"> members and discussing our interpretations of what Bryce has said.</w:t>
+      </w:r>
+    </w:p>
+    <w:p>
       <w:pPr>
         <w:pStyle w:val="Heading2"/>
       </w:pPr>
@@ -2648,11 +2705,74 @@
       </w:r>
     </w:p>
     <w:p>
+      <w:r>
+        <w:t>Wednesday, August 26</w:t>
+      </w:r>
+    </w:p>
+    <w:p>
+      <w:r>
+        <w:t>11:00-12:00 (1hr)</w:t>
+      </w:r>
+    </w:p>
+    <w:p>
+      <w:r>
+        <w:t>Meeting with Clement, see week 7 meeting minutes.</w:t>
+      </w:r>
+    </w:p>
+    <w:p>
+      <w:r>
+        <w:t>Friday, August 28</w:t>
+      </w:r>
+    </w:p>
+    <w:p>
+      <w:r>
+        <w:t>10</w:t>
+      </w:r>
+      <w:r>
+        <w:t>:00</w:t>
+      </w:r>
+      <w:r>
+        <w:t>AM</w:t>
+      </w:r>
+      <w:r>
+        <w:t>-12</w:t>
+      </w:r>
+      <w:r>
+        <w:t>:15</w:t>
+      </w:r>
+      <w:r>
+        <w:t>PM</w:t>
+      </w:r>
+      <w:r>
+        <w:t xml:space="preserve"> (2hrs 15min)</w:t>
+      </w:r>
+    </w:p>
+    <w:p>
+      <w:r>
+        <w:t xml:space="preserve">Meeting with Bryce, he went over specific wording of the document while I changed it in real time. He suggests we use WinSCP to create and extract our case files from the remote machine. Sending the document to </w:t>
+      </w:r>
+      <w:r>
+        <w:t>Bryce</w:t>
+      </w:r>
+      <w:r>
+        <w:t xml:space="preserve"> as a pdf makes me figure we need to make sure the word converts to pdf without any missing references. We addressed how we define our tools and that foremost cant read a </w:t>
+      </w:r>
+      <w:proofErr w:type="spellStart"/>
+      <w:r>
+        <w:t>pcap</w:t>
+      </w:r>
+      <w:proofErr w:type="spellEnd"/>
+      <w:r>
+        <w:t xml:space="preserve"> file so we cannot have 3tools x3test files = 9 tests.</w:t>
+      </w:r>
+    </w:p>
+    <w:p>
       <w:pPr>
         <w:pStyle w:val="Heading2"/>
       </w:pPr>
       <w:bookmarkStart w:id="4" w:name="_Toc238465155"/>
       <w:r>
+        <w:lastRenderedPageBreak/>
         <w:t>Client Meetings</w:t>
       </w:r>
       <w:bookmarkEnd w:id="4"/>
@@ -2726,6 +2846,229 @@
       </w:r>
       <w:r>
         <w:t>.</w:t>
+      </w:r>
+    </w:p>
+    <w:p>
+      <w:r>
+        <w:t>3:00-</w:t>
+      </w:r>
+      <w:r>
+        <w:t>4:00PM (1 hr)</w:t>
+      </w:r>
+    </w:p>
+    <w:p>
+      <w:r>
+        <w:t>Adding</w:t>
+      </w:r>
+      <w:r>
+        <w:t>/improving</w:t>
+      </w:r>
+      <w:r>
+        <w:t xml:space="preserve"> description of how AI is specifically involved in this project</w:t>
+      </w:r>
+      <w:r>
+        <w:t xml:space="preserve"> to the proposal. Gave specific information about what the state of data is and where it is being fed to the LLM models.</w:t>
+      </w:r>
+    </w:p>
+    <w:p>
+      <w:r>
+        <w:t xml:space="preserve">5:30 </w:t>
+      </w:r>
+      <w:r>
+        <w:t>–</w:t>
+      </w:r>
+      <w:r>
+        <w:t xml:space="preserve"> </w:t>
+      </w:r>
+      <w:r>
+        <w:t>6</w:t>
+      </w:r>
+      <w:r>
+        <w:t>:</w:t>
+      </w:r>
+      <w:r>
+        <w:t>00</w:t>
+      </w:r>
+      <w:r>
+        <w:t>PM</w:t>
+      </w:r>
+      <w:r>
+        <w:t xml:space="preserve"> (</w:t>
+      </w:r>
+      <w:r>
+        <w:t>30</w:t>
+      </w:r>
+      <w:r>
+        <w:t xml:space="preserve"> mins)</w:t>
+      </w:r>
+    </w:p>
+    <w:p>
+      <w:r>
+        <w:t xml:space="preserve">Proposal: </w:t>
+      </w:r>
+      <w:r>
+        <w:t>Fully rewrote the statement on our primary deliverable to better reflect how we are comparing the ability of LLMs to produce a forensic analysis</w:t>
+      </w:r>
+      <w:r>
+        <w:t xml:space="preserve"> rather than directly performing forensic activities on a forensic disk image</w:t>
+      </w:r>
+      <w:r>
+        <w:t>, I also specified what kind of video we are making as a project deliverable.</w:t>
+      </w:r>
+    </w:p>
+    <w:p>
+      <w:r>
+        <w:t>6:00-7:00</w:t>
+      </w:r>
+      <w:r>
+        <w:t>PM</w:t>
+      </w:r>
+      <w:r>
+        <w:t xml:space="preserve"> (1 hr)</w:t>
+      </w:r>
+    </w:p>
+    <w:p>
+      <w:r>
+        <w:t xml:space="preserve">Proposal: </w:t>
+      </w:r>
+      <w:r>
+        <w:t>I modified my statement on agentic AI to say why we are likely not employing agentic autonomous AI systems on this project. I began crossing off “required” items from the proposal feedback document</w:t>
+      </w:r>
+      <w:r>
+        <w:t>, to systematically discover what needs to be done</w:t>
+      </w:r>
+      <w:r>
+        <w:t>. From this I recognized that the project objectives section other than the deliverables portion, is lacking in content and is out of date to the philosophy of the project.</w:t>
+      </w:r>
+      <w:r>
+        <w:t xml:space="preserve"> </w:t>
+      </w:r>
+      <w:r>
+        <w:t>I modified the “must haves” section to reflect the new direction of the project and to increase its size.</w:t>
+      </w:r>
+    </w:p>
+    <w:p>
+      <w:r>
+        <w:t>Thursday</w:t>
+      </w:r>
+      <w:r>
+        <w:t>, August 2</w:t>
+      </w:r>
+      <w:r>
+        <w:t>7</w:t>
+      </w:r>
+    </w:p>
+    <w:p>
+      <w:r>
+        <w:t>4:30-</w:t>
+      </w:r>
+      <w:r>
+        <w:t>5:00</w:t>
+      </w:r>
+      <w:r>
+        <w:t>PM</w:t>
+      </w:r>
+      <w:r>
+        <w:t xml:space="preserve"> (30 mins)</w:t>
+      </w:r>
+    </w:p>
+    <w:p>
+      <w:r>
+        <w:t xml:space="preserve">Proposal: </w:t>
+      </w:r>
+      <w:r>
+        <w:t>Included statement on the AI-integration challenge in the “must have’s” section</w:t>
+      </w:r>
+      <w:r>
+        <w:t>.</w:t>
+      </w:r>
+    </w:p>
+    <w:p>
+      <w:r>
+        <w:t>7:00-</w:t>
+      </w:r>
+      <w:r>
+        <w:t>9</w:t>
+      </w:r>
+      <w:r>
+        <w:t>:</w:t>
+      </w:r>
+      <w:r>
+        <w:t>45</w:t>
+      </w:r>
+      <w:r>
+        <w:t>PM</w:t>
+      </w:r>
+      <w:r>
+        <w:t xml:space="preserve"> (</w:t>
+      </w:r>
+      <w:r>
+        <w:t>2</w:t>
+      </w:r>
+      <w:r>
+        <w:t>hrs</w:t>
+      </w:r>
+      <w:r>
+        <w:t xml:space="preserve"> 45 mins</w:t>
+      </w:r>
+      <w:r>
+        <w:t>)</w:t>
+      </w:r>
+    </w:p>
+    <w:p>
+      <w:r>
+        <w:t xml:space="preserve">Proposal: Wrote a section under “must haves” about testing reliability, test cases, identifying metrics, blind exposure for impartial collection of data. I wrote another </w:t>
+      </w:r>
+      <w:r>
+        <w:t>section under “nice to haves” all about constraining, engineering, and volume-testing the LLMs.</w:t>
+      </w:r>
+      <w:r>
+        <w:t xml:space="preserve"> Wrote paragraph about engineering the AI to reduce its flaws. Wrote “HITL” paragraph about conducting hybrid human-led tests.</w:t>
+      </w:r>
+      <w:r>
+        <w:t xml:space="preserve"> Also wrote a small section stating we must install and configure at m</w:t>
+      </w:r>
+      <w:r>
+        <w:t>inimum. I lengthened the problem statement with a mention of the human investigators.</w:t>
+      </w:r>
+      <w:r>
+        <w:t xml:space="preserve"> </w:t>
+      </w:r>
+      <w:r>
+        <w:t>I then read over the entire document as we are likely reviewing it with Bryce this following day.</w:t>
+      </w:r>
+      <w:r>
+        <w:t xml:space="preserve"> I fixed the end of the first scope statement that still reflected the old idea that we were comparing </w:t>
+      </w:r>
+      <w:r>
+        <w:t>AI tools with regular tools rather than the application of regular tools by AI.</w:t>
+      </w:r>
+    </w:p>
+    <w:p/>
+    <w:p/>
+    <w:p>
+      <w:r>
+        <w:lastRenderedPageBreak/>
+        <w:t>Friday, August 28</w:t>
+      </w:r>
+    </w:p>
+    <w:p>
+      <w:r>
+        <w:t>2:00</w:t>
+      </w:r>
+    </w:p>
+    <w:p>
+      <w:r>
+        <w:t xml:space="preserve">Working on the proposal, I modify comments I made during meeting with </w:t>
+      </w:r>
+      <w:r>
+        <w:t>Bryce</w:t>
+      </w:r>
+      <w:r>
+        <w:t xml:space="preserve"> and debrief to assign work to some individuals. Then I fixed the parts of the proposal that I created comments on but could</w:t>
+      </w:r>
+      <w:r>
+        <w:t xml:space="preserve"> not fix in real time.</w:t>
       </w:r>
     </w:p>
     <w:p>

</xml_diff>

<commit_message>
updated logs added week 8 logs
</commit_message>
<xml_diff>
--- a/Weekly Logs/Matt/Matt Baker - Week 7 Individual Logbook.docx
+++ b/Weekly Logs/Matt/Matt Baker - Week 7 Individual Logbook.docx
@@ -1861,6 +1861,12 @@
               </w:rPr>
               <w:t xml:space="preserve">  </w:t>
             </w:r>
+            <w:r>
+              <w:rPr>
+                <w:sz w:val="24"/>
+              </w:rPr>
+              <w:t>4hrs 15 mins</w:t>
+            </w:r>
           </w:p>
         </w:tc>
       </w:tr>
@@ -1963,6 +1969,12 @@
               </w:rPr>
               <w:t xml:space="preserve">  </w:t>
             </w:r>
+            <w:r>
+              <w:rPr>
+                <w:sz w:val="24"/>
+              </w:rPr>
+              <w:t>4hrs 15 mins</w:t>
+            </w:r>
           </w:p>
         </w:tc>
       </w:tr>
@@ -2014,6 +2026,30 @@
               </w:rPr>
               <w:t xml:space="preserve">  </w:t>
             </w:r>
+            <w:r>
+              <w:rPr>
+                <w:sz w:val="24"/>
+              </w:rPr>
+              <w:t>5</w:t>
+            </w:r>
+            <w:r>
+              <w:rPr>
+                <w:sz w:val="24"/>
+              </w:rPr>
+              <w:t>hr</w:t>
+            </w:r>
+            <w:r>
+              <w:rPr>
+                <w:sz w:val="24"/>
+              </w:rPr>
+              <w:t>s</w:t>
+            </w:r>
+            <w:r>
+              <w:rPr>
+                <w:sz w:val="24"/>
+              </w:rPr>
+              <w:t xml:space="preserve"> 15 mins</w:t>
+            </w:r>
           </w:p>
         </w:tc>
       </w:tr>
@@ -2116,6 +2152,12 @@
               </w:rPr>
               <w:t xml:space="preserve">  </w:t>
             </w:r>
+            <w:r>
+              <w:rPr>
+                <w:sz w:val="24"/>
+              </w:rPr>
+              <w:t>4hrs 15 mins</w:t>
+            </w:r>
           </w:p>
         </w:tc>
       </w:tr>
@@ -2167,6 +2209,12 @@
               </w:rPr>
               <w:t xml:space="preserve">  </w:t>
             </w:r>
+            <w:r>
+              <w:rPr>
+                <w:sz w:val="24"/>
+              </w:rPr>
+              <w:t>8hrs 45 mins</w:t>
+            </w:r>
           </w:p>
         </w:tc>
       </w:tr>
@@ -2384,6 +2432,9 @@
               <w:spacing w:after="0" w:line="259" w:lineRule="auto"/>
               <w:ind w:left="0" w:firstLine="0"/>
             </w:pPr>
+            <w:r>
+              <w:t>27 hr 45 mins</w:t>
+            </w:r>
           </w:p>
         </w:tc>
       </w:tr>
@@ -2459,7 +2510,7 @@
               <w:rPr>
                 <w:sz w:val="24"/>
               </w:rPr>
-              <w:t>0</w:t>
+              <w:t>131 hrs</w:t>
             </w:r>
             <w:r>
               <w:rPr>
@@ -2661,6 +2712,9 @@
       <w:r>
         <w:t xml:space="preserve"> PM</w:t>
       </w:r>
+      <w:r>
+        <w:t xml:space="preserve"> (1hr, 45mins)</w:t>
+      </w:r>
     </w:p>
     <w:p>
       <w:r>
@@ -2755,7 +2809,15 @@
         <w:t>Bryce</w:t>
       </w:r>
       <w:r>
-        <w:t xml:space="preserve"> as a pdf makes me figure we need to make sure the word converts to pdf without any missing references. We addressed how we define our tools and that foremost cant read a </w:t>
+        <w:t xml:space="preserve"> as a pdf makes me figure we need to make sure the word converts to pdf without any missing references. We addressed how we define our tools and that foremost </w:t>
+      </w:r>
+      <w:proofErr w:type="spellStart"/>
+      <w:r>
+        <w:t>cant</w:t>
+      </w:r>
+      <w:proofErr w:type="spellEnd"/>
+      <w:r>
+        <w:t xml:space="preserve"> read a </w:t>
       </w:r>
       <w:proofErr w:type="spellStart"/>
       <w:r>
@@ -3056,6 +3118,9 @@
       <w:r>
         <w:t>2:00</w:t>
       </w:r>
+      <w:r>
+        <w:t>-2:30PM (30 mins)</w:t>
+      </w:r>
     </w:p>
     <w:p>
       <w:r>
@@ -3072,6 +3137,60 @@
       </w:r>
     </w:p>
     <w:p>
+      <w:r>
+        <w:t>Saturday, August 29</w:t>
+      </w:r>
+    </w:p>
+    <w:p>
+      <w:r>
+        <w:t>3:00PM –</w:t>
+      </w:r>
+      <w:r>
+        <w:t xml:space="preserve"> </w:t>
+      </w:r>
+      <w:r>
+        <w:t>5</w:t>
+      </w:r>
+      <w:r>
+        <w:t>:00PM</w:t>
+      </w:r>
+      <w:r>
+        <w:t xml:space="preserve"> (2hrs)</w:t>
+      </w:r>
+    </w:p>
+    <w:p>
+      <w:r>
+        <w:t>Working on proposal, even though we don’t upload it in pdf I spent some time making sure it converted well to that format. Added more objects</w:t>
+      </w:r>
+      <w:r>
+        <w:t xml:space="preserve"> and </w:t>
+      </w:r>
+      <w:r>
+        <w:t>updated the</w:t>
+      </w:r>
+      <w:r>
+        <w:t xml:space="preserve"> RACI matrix as far as tasks and responsibilities.</w:t>
+      </w:r>
+      <w:r>
+        <w:t xml:space="preserve"> Adjusted our roles</w:t>
+      </w:r>
+      <w:r>
+        <w:t xml:space="preserve"> in our group members/communication table to reflect the change in PM and responsibilities</w:t>
+      </w:r>
+      <w:r>
+        <w:t>. Improved my explanation of generative AI</w:t>
+      </w:r>
+      <w:r>
+        <w:t xml:space="preserve"> with references</w:t>
+      </w:r>
+      <w:r>
+        <w:t>.</w:t>
+      </w:r>
+      <w:r>
+        <w:t xml:space="preserve"> Modified our “group members” header explanation</w:t>
+      </w:r>
+    </w:p>
+    <w:p>
       <w:pPr>
         <w:pStyle w:val="Heading2"/>
       </w:pPr>
@@ -3082,6 +3201,613 @@
       <w:bookmarkEnd w:id="7"/>
     </w:p>
     <w:p>
+      <w:r>
+        <w:t>Saturday, August 29</w:t>
+      </w:r>
+    </w:p>
+    <w:p>
+      <w:r>
+        <w:t xml:space="preserve">6:00 – </w:t>
+      </w:r>
+      <w:r>
+        <w:t>8:15</w:t>
+      </w:r>
+      <w:r>
+        <w:t>PM (</w:t>
+      </w:r>
+      <w:r>
+        <w:t>2</w:t>
+      </w:r>
+      <w:r>
+        <w:t xml:space="preserve"> hr</w:t>
+      </w:r>
+      <w:r>
+        <w:t>s</w:t>
+      </w:r>
+      <w:r>
+        <w:t xml:space="preserve"> 15 mins</w:t>
+      </w:r>
+      <w:r>
+        <w:t>)</w:t>
+      </w:r>
+    </w:p>
+    <w:p>
+      <w:r>
+        <w:t>Install</w:t>
+      </w:r>
+      <w:r>
+        <w:t>ed</w:t>
+      </w:r>
+      <w:r>
+        <w:t xml:space="preserve"> and configur</w:t>
+      </w:r>
+      <w:r>
+        <w:t>ed</w:t>
+      </w:r>
+      <w:r>
+        <w:t xml:space="preserve"> WinSCP 6.5.6</w:t>
+      </w:r>
+    </w:p>
+    <w:p>
+      <w:r>
+        <w:t xml:space="preserve">This is me connecting to the remote PC via SFTP protocol, I can now view its directories, and transfer files between my Windows PC (1) and the Kali instance (2). As you can </w:t>
+      </w:r>
+      <w:r>
+        <w:t>see,</w:t>
+      </w:r>
+      <w:r>
+        <w:t xml:space="preserve"> I created some directories representing the 18 </w:t>
+      </w:r>
+      <w:r>
+        <w:t>required directories of 3 tools, tested on 3 case files, with 2 means (3x3x2). I can use this now to transfer case files, evidence, and reports to and from the “remote server”.</w:t>
+      </w:r>
+    </w:p>
+    <w:p>
+      <w:r>
+        <w:rPr>
+          <w:noProof/>
+        </w:rPr>
+        <w:drawing>
+          <wp:inline distT="0" distB="0" distL="0" distR="0" wp14:anchorId="2C1D663A" wp14:editId="66E0C5D6">
+            <wp:extent cx="5505450" cy="3711587"/>
+            <wp:effectExtent l="0" t="0" r="0" b="3175"/>
+            <wp:docPr id="1977254770" name="Picture 1"/>
+            <wp:cNvGraphicFramePr>
+              <a:graphicFrameLocks xmlns:a="http://schemas.openxmlformats.org/drawingml/2006/main" noChangeAspect="1"/>
+            </wp:cNvGraphicFramePr>
+            <a:graphic xmlns:a="http://schemas.openxmlformats.org/drawingml/2006/main">
+              <a:graphicData uri="http://schemas.openxmlformats.org/drawingml/2006/picture">
+                <pic:pic xmlns:pic="http://schemas.openxmlformats.org/drawingml/2006/picture">
+                  <pic:nvPicPr>
+                    <pic:cNvPr id="1977254770" name=""/>
+                    <pic:cNvPicPr/>
+                  </pic:nvPicPr>
+                  <pic:blipFill>
+                    <a:blip r:embed="rId9"/>
+                    <a:stretch>
+                      <a:fillRect/>
+                    </a:stretch>
+                  </pic:blipFill>
+                  <pic:spPr>
+                    <a:xfrm>
+                      <a:off x="0" y="0"/>
+                      <a:ext cx="5507018" cy="3712644"/>
+                    </a:xfrm>
+                    <a:prstGeom prst="rect">
+                      <a:avLst/>
+                    </a:prstGeom>
+                  </pic:spPr>
+                </pic:pic>
+              </a:graphicData>
+            </a:graphic>
+          </wp:inline>
+        </w:drawing>
+      </w:r>
+    </w:p>
+    <w:p>
+      <w:r>
+        <w:lastRenderedPageBreak/>
+        <w:t>Sunday, August 30</w:t>
+      </w:r>
+    </w:p>
+    <w:p>
+      <w:r>
+        <w:t>12:00-</w:t>
+      </w:r>
+      <w:r>
+        <w:t>3</w:t>
+      </w:r>
+      <w:r>
+        <w:t>:00PM</w:t>
+      </w:r>
+      <w:r>
+        <w:t xml:space="preserve"> (</w:t>
+      </w:r>
+      <w:r>
+        <w:t>2</w:t>
+      </w:r>
+      <w:r>
+        <w:t>hr</w:t>
+      </w:r>
+      <w:r>
+        <w:t>s</w:t>
+      </w:r>
+      <w:r>
+        <w:t>)</w:t>
+      </w:r>
+    </w:p>
+    <w:p>
+      <w:r>
+        <w:t>Downloading and installing the SSH client “PuTTY” for interfacing with the remote desktop.</w:t>
+      </w:r>
+      <w:r>
+        <w:t xml:space="preserve"> As this is the preferred interface method for Bryce. </w:t>
+      </w:r>
+      <w:r>
+        <w:br/>
+        <w:t>I installed a couple of new models too through SSH, Llama 3 and Llama 3.3, a ~38 GB difference between these models.</w:t>
+      </w:r>
+    </w:p>
+    <w:p>
+      <w:r>
+        <w:rPr>
+          <w:noProof/>
+        </w:rPr>
+        <w:drawing>
+          <wp:inline distT="0" distB="0" distL="0" distR="0" wp14:anchorId="2B6F3A0C" wp14:editId="32A7DA5E">
+            <wp:extent cx="5729605" cy="753745"/>
+            <wp:effectExtent l="0" t="0" r="4445" b="8255"/>
+            <wp:docPr id="1721199259" name="Picture 1"/>
+            <wp:cNvGraphicFramePr>
+              <a:graphicFrameLocks xmlns:a="http://schemas.openxmlformats.org/drawingml/2006/main" noChangeAspect="1"/>
+            </wp:cNvGraphicFramePr>
+            <a:graphic xmlns:a="http://schemas.openxmlformats.org/drawingml/2006/main">
+              <a:graphicData uri="http://schemas.openxmlformats.org/drawingml/2006/picture">
+                <pic:pic xmlns:pic="http://schemas.openxmlformats.org/drawingml/2006/picture">
+                  <pic:nvPicPr>
+                    <pic:cNvPr id="1721199259" name=""/>
+                    <pic:cNvPicPr/>
+                  </pic:nvPicPr>
+                  <pic:blipFill>
+                    <a:blip r:embed="rId10"/>
+                    <a:stretch>
+                      <a:fillRect/>
+                    </a:stretch>
+                  </pic:blipFill>
+                  <pic:spPr>
+                    <a:xfrm>
+                      <a:off x="0" y="0"/>
+                      <a:ext cx="5729605" cy="753745"/>
+                    </a:xfrm>
+                    <a:prstGeom prst="rect">
+                      <a:avLst/>
+                    </a:prstGeom>
+                  </pic:spPr>
+                </pic:pic>
+              </a:graphicData>
+            </a:graphic>
+          </wp:inline>
+        </w:drawing>
+      </w:r>
+      <w:r>
+        <w:br/>
+      </w:r>
+      <w:r>
+        <w:rPr>
+          <w:noProof/>
+        </w:rPr>
+        <w:drawing>
+          <wp:inline distT="0" distB="0" distL="0" distR="0" wp14:anchorId="51711F62" wp14:editId="283BDB2C">
+            <wp:extent cx="5729605" cy="1174750"/>
+            <wp:effectExtent l="0" t="0" r="4445" b="6350"/>
+            <wp:docPr id="606356748" name="Picture 1"/>
+            <wp:cNvGraphicFramePr>
+              <a:graphicFrameLocks xmlns:a="http://schemas.openxmlformats.org/drawingml/2006/main" noChangeAspect="1"/>
+            </wp:cNvGraphicFramePr>
+            <a:graphic xmlns:a="http://schemas.openxmlformats.org/drawingml/2006/main">
+              <a:graphicData uri="http://schemas.openxmlformats.org/drawingml/2006/picture">
+                <pic:pic xmlns:pic="http://schemas.openxmlformats.org/drawingml/2006/picture">
+                  <pic:nvPicPr>
+                    <pic:cNvPr id="606356748" name=""/>
+                    <pic:cNvPicPr/>
+                  </pic:nvPicPr>
+                  <pic:blipFill>
+                    <a:blip r:embed="rId11"/>
+                    <a:stretch>
+                      <a:fillRect/>
+                    </a:stretch>
+                  </pic:blipFill>
+                  <pic:spPr>
+                    <a:xfrm>
+                      <a:off x="0" y="0"/>
+                      <a:ext cx="5729605" cy="1174750"/>
+                    </a:xfrm>
+                    <a:prstGeom prst="rect">
+                      <a:avLst/>
+                    </a:prstGeom>
+                  </pic:spPr>
+                </pic:pic>
+              </a:graphicData>
+            </a:graphic>
+          </wp:inline>
+        </w:drawing>
+      </w:r>
+    </w:p>
+    <w:p>
+      <w:r>
+        <w:t xml:space="preserve">I made the Windows desktop application version of Nmap scan my default gateway, and saved it as an XML, the intention of testing if models hosted via </w:t>
+      </w:r>
+      <w:proofErr w:type="spellStart"/>
+      <w:r>
+        <w:t>Ollama</w:t>
+      </w:r>
+      <w:proofErr w:type="spellEnd"/>
+      <w:r>
+        <w:t xml:space="preserve"> could read them.</w:t>
+      </w:r>
+    </w:p>
+    <w:p>
+      <w:r>
+        <w:rPr>
+          <w:noProof/>
+        </w:rPr>
+        <w:drawing>
+          <wp:inline distT="0" distB="0" distL="0" distR="0" wp14:anchorId="32DBEEA6" wp14:editId="5265EEA1">
+            <wp:extent cx="5729605" cy="2806065"/>
+            <wp:effectExtent l="0" t="0" r="4445" b="0"/>
+            <wp:docPr id="37887583" name="Picture 1"/>
+            <wp:cNvGraphicFramePr>
+              <a:graphicFrameLocks xmlns:a="http://schemas.openxmlformats.org/drawingml/2006/main" noChangeAspect="1"/>
+            </wp:cNvGraphicFramePr>
+            <a:graphic xmlns:a="http://schemas.openxmlformats.org/drawingml/2006/main">
+              <a:graphicData uri="http://schemas.openxmlformats.org/drawingml/2006/picture">
+                <pic:pic xmlns:pic="http://schemas.openxmlformats.org/drawingml/2006/picture">
+                  <pic:nvPicPr>
+                    <pic:cNvPr id="37887583" name=""/>
+                    <pic:cNvPicPr/>
+                  </pic:nvPicPr>
+                  <pic:blipFill>
+                    <a:blip r:embed="rId12"/>
+                    <a:stretch>
+                      <a:fillRect/>
+                    </a:stretch>
+                  </pic:blipFill>
+                  <pic:spPr>
+                    <a:xfrm>
+                      <a:off x="0" y="0"/>
+                      <a:ext cx="5729605" cy="2806065"/>
+                    </a:xfrm>
+                    <a:prstGeom prst="rect">
+                      <a:avLst/>
+                    </a:prstGeom>
+                  </pic:spPr>
+                </pic:pic>
+              </a:graphicData>
+            </a:graphic>
+          </wp:inline>
+        </w:drawing>
+      </w:r>
+    </w:p>
+    <w:p>
+      <w:r>
+        <w:t>This test will also determine if I can use Putty whilst using WinSCP, and it appears I can, they use different ports after all.</w:t>
+      </w:r>
+    </w:p>
+    <w:p>
+      <w:r>
+        <w:rPr>
+          <w:noProof/>
+        </w:rPr>
+        <w:lastRenderedPageBreak/>
+        <w:drawing>
+          <wp:inline distT="0" distB="0" distL="0" distR="0" wp14:anchorId="3520F08E" wp14:editId="3EC69B8A">
+            <wp:extent cx="5305425" cy="3574973"/>
+            <wp:effectExtent l="0" t="0" r="0" b="6985"/>
+            <wp:docPr id="555201141" name="Picture 1"/>
+            <wp:cNvGraphicFramePr>
+              <a:graphicFrameLocks xmlns:a="http://schemas.openxmlformats.org/drawingml/2006/main" noChangeAspect="1"/>
+            </wp:cNvGraphicFramePr>
+            <a:graphic xmlns:a="http://schemas.openxmlformats.org/drawingml/2006/main">
+              <a:graphicData uri="http://schemas.openxmlformats.org/drawingml/2006/picture">
+                <pic:pic xmlns:pic="http://schemas.openxmlformats.org/drawingml/2006/picture">
+                  <pic:nvPicPr>
+                    <pic:cNvPr id="555201141" name=""/>
+                    <pic:cNvPicPr/>
+                  </pic:nvPicPr>
+                  <pic:blipFill>
+                    <a:blip r:embed="rId13"/>
+                    <a:stretch>
+                      <a:fillRect/>
+                    </a:stretch>
+                  </pic:blipFill>
+                  <pic:spPr>
+                    <a:xfrm>
+                      <a:off x="0" y="0"/>
+                      <a:ext cx="5308897" cy="3577312"/>
+                    </a:xfrm>
+                    <a:prstGeom prst="rect">
+                      <a:avLst/>
+                    </a:prstGeom>
+                  </pic:spPr>
+                </pic:pic>
+              </a:graphicData>
+            </a:graphic>
+          </wp:inline>
+        </w:drawing>
+      </w:r>
+    </w:p>
+    <w:p>
+      <w:r>
+        <w:t>I fed my xml text directly to Llama3, asking for a forensically relevant rundown. Its output is somewhat informal, but with a comprehensive explanation with some insights, “suggestions”. I’d say we need to engineer the AI to format Nmap results without informal language. The results may vary too when it comes to creating observations and consolidating information a multi-host scan.</w:t>
+      </w:r>
+    </w:p>
+    <w:p>
+      <w:r>
+        <w:rPr>
+          <w:noProof/>
+        </w:rPr>
+        <w:drawing>
+          <wp:inline distT="0" distB="0" distL="0" distR="0" wp14:anchorId="520A1E52" wp14:editId="3A2CD654">
+            <wp:extent cx="4505325" cy="4196248"/>
+            <wp:effectExtent l="0" t="0" r="0" b="0"/>
+            <wp:docPr id="888260559" name="Picture 1"/>
+            <wp:cNvGraphicFramePr>
+              <a:graphicFrameLocks xmlns:a="http://schemas.openxmlformats.org/drawingml/2006/main" noChangeAspect="1"/>
+            </wp:cNvGraphicFramePr>
+            <a:graphic xmlns:a="http://schemas.openxmlformats.org/drawingml/2006/main">
+              <a:graphicData uri="http://schemas.openxmlformats.org/drawingml/2006/picture">
+                <pic:pic xmlns:pic="http://schemas.openxmlformats.org/drawingml/2006/picture">
+                  <pic:nvPicPr>
+                    <pic:cNvPr id="888260559" name=""/>
+                    <pic:cNvPicPr/>
+                  </pic:nvPicPr>
+                  <pic:blipFill>
+                    <a:blip r:embed="rId14"/>
+                    <a:stretch>
+                      <a:fillRect/>
+                    </a:stretch>
+                  </pic:blipFill>
+                  <pic:spPr>
+                    <a:xfrm>
+                      <a:off x="0" y="0"/>
+                      <a:ext cx="4512469" cy="4202902"/>
+                    </a:xfrm>
+                    <a:prstGeom prst="rect">
+                      <a:avLst/>
+                    </a:prstGeom>
+                  </pic:spPr>
+                </pic:pic>
+              </a:graphicData>
+            </a:graphic>
+          </wp:inline>
+        </w:drawing>
+      </w:r>
+    </w:p>
+    <w:p>
+      <w:r>
+        <w:lastRenderedPageBreak/>
+        <w:t xml:space="preserve">I will attempt to feed a model the Foremost output next, I’m not sure how to feed images directly into </w:t>
+      </w:r>
+      <w:proofErr w:type="spellStart"/>
+      <w:r>
+        <w:t>Ollama</w:t>
+      </w:r>
+      <w:proofErr w:type="spellEnd"/>
+      <w:r>
+        <w:t>. Documentation uses gemma4 to view images, so I will test its capacity on a single example.</w:t>
+      </w:r>
+    </w:p>
+    <w:p>
+      <w:r>
+        <w:t xml:space="preserve">I moved “His Master’s Voice” by Francis Barraud to the </w:t>
+      </w:r>
+      <w:proofErr w:type="spellStart"/>
+      <w:r>
+        <w:t>bsdh</w:t>
+      </w:r>
+      <w:proofErr w:type="spellEnd"/>
+      <w:r>
+        <w:t xml:space="preserve"> pictures directory.</w:t>
+      </w:r>
+    </w:p>
+    <w:p>
+      <w:r>
+        <w:rPr>
+          <w:noProof/>
+        </w:rPr>
+        <w:drawing>
+          <wp:inline distT="0" distB="0" distL="0" distR="0" wp14:anchorId="5D08D445" wp14:editId="24C8BAC6">
+            <wp:extent cx="5664530" cy="4238823"/>
+            <wp:effectExtent l="0" t="0" r="0" b="0"/>
+            <wp:docPr id="38229635" name="Picture 6"/>
+            <wp:cNvGraphicFramePr>
+              <a:graphicFrameLocks xmlns:a="http://schemas.openxmlformats.org/drawingml/2006/main" noChangeAspect="1"/>
+            </wp:cNvGraphicFramePr>
+            <a:graphic xmlns:a="http://schemas.openxmlformats.org/drawingml/2006/main">
+              <a:graphicData uri="http://schemas.openxmlformats.org/drawingml/2006/picture">
+                <pic:pic xmlns:pic="http://schemas.openxmlformats.org/drawingml/2006/picture">
+                  <pic:nvPicPr>
+                    <pic:cNvPr id="0" name="Picture 6"/>
+                    <pic:cNvPicPr>
+                      <a:picLocks noChangeAspect="1" noChangeArrowheads="1"/>
+                    </pic:cNvPicPr>
+                  </pic:nvPicPr>
+                  <pic:blipFill>
+                    <a:blip r:embed="rId15" cstate="print">
+                      <a:extLst>
+                        <a:ext uri="{28A0092B-C50C-407E-A947-70E740481C1C}">
+                          <a14:useLocalDpi xmlns:a14="http://schemas.microsoft.com/office/drawing/2010/main" val="0"/>
+                        </a:ext>
+                      </a:extLst>
+                    </a:blip>
+                    <a:srcRect/>
+                    <a:stretch>
+                      <a:fillRect/>
+                    </a:stretch>
+                  </pic:blipFill>
+                  <pic:spPr bwMode="auto">
+                    <a:xfrm>
+                      <a:off x="0" y="0"/>
+                      <a:ext cx="5696311" cy="4262605"/>
+                    </a:xfrm>
+                    <a:prstGeom prst="rect">
+                      <a:avLst/>
+                    </a:prstGeom>
+                    <a:noFill/>
+                    <a:ln>
+                      <a:noFill/>
+                    </a:ln>
+                  </pic:spPr>
+                </pic:pic>
+              </a:graphicData>
+            </a:graphic>
+          </wp:inline>
+        </w:drawing>
+      </w:r>
+    </w:p>
+    <w:p/>
+    <w:p/>
+    <w:p/>
+    <w:p/>
+    <w:p/>
+    <w:p/>
+    <w:p/>
+    <w:p/>
+    <w:p/>
+    <w:p/>
+    <w:p/>
+    <w:p>
+      <w:pPr>
+        <w:ind w:left="0" w:firstLine="0"/>
+      </w:pPr>
+    </w:p>
+    <w:p>
+      <w:r>
+        <w:lastRenderedPageBreak/>
+        <w:t>There are some observations we can make about this output. It</w:t>
+      </w:r>
+      <w:r>
+        <w:t xml:space="preserve"> must not be able to read the title of the piece, as that context would likely clarify what the dog is listening to. The signature I asked it to identify is intentionally cut off, instead of referring to the title of the piece, or suggesting it is impossible to know fully, identifying this cutoff point, it confidently states the wrong name “FRANCIS BARKER”. A human examiner would likely identify correctly that this is obfuscated.</w:t>
+      </w:r>
+    </w:p>
+    <w:p>
+      <w:r>
+        <w:rPr>
+          <w:noProof/>
+        </w:rPr>
+        <w:drawing>
+          <wp:inline distT="0" distB="0" distL="0" distR="0" wp14:anchorId="3E81F327" wp14:editId="2916F56F">
+            <wp:extent cx="5807034" cy="6114021"/>
+            <wp:effectExtent l="0" t="0" r="3810" b="1270"/>
+            <wp:docPr id="1270322816" name="Picture 1"/>
+            <wp:cNvGraphicFramePr>
+              <a:graphicFrameLocks xmlns:a="http://schemas.openxmlformats.org/drawingml/2006/main" noChangeAspect="1"/>
+            </wp:cNvGraphicFramePr>
+            <a:graphic xmlns:a="http://schemas.openxmlformats.org/drawingml/2006/main">
+              <a:graphicData uri="http://schemas.openxmlformats.org/drawingml/2006/picture">
+                <pic:pic xmlns:pic="http://schemas.openxmlformats.org/drawingml/2006/picture">
+                  <pic:nvPicPr>
+                    <pic:cNvPr id="1270322816" name=""/>
+                    <pic:cNvPicPr/>
+                  </pic:nvPicPr>
+                  <pic:blipFill>
+                    <a:blip r:embed="rId16"/>
+                    <a:stretch>
+                      <a:fillRect/>
+                    </a:stretch>
+                  </pic:blipFill>
+                  <pic:spPr>
+                    <a:xfrm>
+                      <a:off x="0" y="0"/>
+                      <a:ext cx="5844481" cy="6153447"/>
+                    </a:xfrm>
+                    <a:prstGeom prst="rect">
+                      <a:avLst/>
+                    </a:prstGeom>
+                  </pic:spPr>
+                </pic:pic>
+              </a:graphicData>
+            </a:graphic>
+          </wp:inline>
+        </w:drawing>
+      </w:r>
+    </w:p>
+    <w:p/>
+    <w:p/>
+    <w:p/>
+    <w:p/>
+    <w:p/>
+    <w:p>
+      <w:r>
+        <w:lastRenderedPageBreak/>
+        <w:t xml:space="preserve">I tried a couple more models such as “nemotron3:33b” </w:t>
+      </w:r>
+      <w:r>
+        <w:t>a model</w:t>
+      </w:r>
+      <w:r>
+        <w:t xml:space="preserve"> optimized for video/document “intelligence workflows”. It attempted many times to read the signature text with much greater </w:t>
+      </w:r>
+      <w:proofErr w:type="gramStart"/>
+      <w:r>
+        <w:t>conviction, but</w:t>
+      </w:r>
+      <w:proofErr w:type="gramEnd"/>
+      <w:r>
+        <w:t xml:space="preserve"> still came up inconclusive thinking it may be “FRANCIS DANA”. We need to engineer our models to just give us what they DO know. Not synthesize an answer. It was funny to see it relock this one part of the prompt </w:t>
+      </w:r>
+      <w:proofErr w:type="gramStart"/>
+      <w:r>
+        <w:t>over and over</w:t>
+      </w:r>
+      <w:proofErr w:type="gramEnd"/>
+      <w:r>
+        <w:t>.</w:t>
+      </w:r>
+    </w:p>
+    <w:p>
+      <w:r>
+        <w:rPr>
+          <w:noProof/>
+        </w:rPr>
+        <w:drawing>
+          <wp:inline distT="0" distB="0" distL="0" distR="0" wp14:anchorId="09BAC6F8" wp14:editId="1B7DB18D">
+            <wp:extent cx="5729605" cy="5842000"/>
+            <wp:effectExtent l="0" t="0" r="4445" b="6350"/>
+            <wp:docPr id="1167533330" name="Picture 1"/>
+            <wp:cNvGraphicFramePr>
+              <a:graphicFrameLocks xmlns:a="http://schemas.openxmlformats.org/drawingml/2006/main" noChangeAspect="1"/>
+            </wp:cNvGraphicFramePr>
+            <a:graphic xmlns:a="http://schemas.openxmlformats.org/drawingml/2006/main">
+              <a:graphicData uri="http://schemas.openxmlformats.org/drawingml/2006/picture">
+                <pic:pic xmlns:pic="http://schemas.openxmlformats.org/drawingml/2006/picture">
+                  <pic:nvPicPr>
+                    <pic:cNvPr id="1167533330" name=""/>
+                    <pic:cNvPicPr/>
+                  </pic:nvPicPr>
+                  <pic:blipFill>
+                    <a:blip r:embed="rId17"/>
+                    <a:stretch>
+                      <a:fillRect/>
+                    </a:stretch>
+                  </pic:blipFill>
+                  <pic:spPr>
+                    <a:xfrm>
+                      <a:off x="0" y="0"/>
+                      <a:ext cx="5729605" cy="5842000"/>
+                    </a:xfrm>
+                    <a:prstGeom prst="rect">
+                      <a:avLst/>
+                    </a:prstGeom>
+                  </pic:spPr>
+                </pic:pic>
+              </a:graphicData>
+            </a:graphic>
+          </wp:inline>
+        </w:drawing>
+      </w:r>
+    </w:p>
+    <w:p>
       <w:pPr>
         <w:pStyle w:val="Heading2"/>
       </w:pPr>
@@ -3092,10 +3818,10 @@
       <w:bookmarkEnd w:id="8"/>
     </w:p>
     <w:sectPr>
-      <w:headerReference w:type="default" r:id="rId9"/>
-      <w:footerReference w:type="even" r:id="rId10"/>
-      <w:footerReference w:type="default" r:id="rId11"/>
-      <w:footerReference w:type="first" r:id="rId12"/>
+      <w:headerReference w:type="default" r:id="rId18"/>
+      <w:footerReference w:type="even" r:id="rId19"/>
+      <w:footerReference w:type="default" r:id="rId20"/>
+      <w:footerReference w:type="first" r:id="rId21"/>
       <w:pgSz w:w="11906" w:h="16838"/>
       <w:pgMar w:top="1483" w:right="1448" w:bottom="1544" w:left="1435" w:header="720" w:footer="730" w:gutter="0"/>
       <w:pgNumType w:start="0"/>

</xml_diff>

<commit_message>
updated week 7 log for missing hour
</commit_message>
<xml_diff>
--- a/Weekly Logs/Matt/Matt Baker - Week 7 Individual Logbook.docx
+++ b/Weekly Logs/Matt/Matt Baker - Week 7 Individual Logbook.docx
@@ -1865,7 +1865,25 @@
               <w:rPr>
                 <w:sz w:val="24"/>
               </w:rPr>
-              <w:t>4hrs 15 mins</w:t>
+              <w:t>5</w:t>
+            </w:r>
+            <w:r>
+              <w:rPr>
+                <w:sz w:val="24"/>
+              </w:rPr>
+              <w:t xml:space="preserve">hrs </w:t>
+            </w:r>
+            <w:r>
+              <w:rPr>
+                <w:sz w:val="24"/>
+              </w:rPr>
+              <w:t>30</w:t>
+            </w:r>
+            <w:r>
+              <w:rPr>
+                <w:sz w:val="24"/>
+              </w:rPr>
+              <w:t xml:space="preserve"> mins</w:t>
             </w:r>
           </w:p>
         </w:tc>
@@ -2433,7 +2451,13 @@
               <w:ind w:left="0" w:firstLine="0"/>
             </w:pPr>
             <w:r>
-              <w:t>27 hr 45 mins</w:t>
+              <w:t>2</w:t>
+            </w:r>
+            <w:r>
+              <w:t>0</w:t>
+            </w:r>
+            <w:r>
+              <w:t>mins</w:t>
             </w:r>
           </w:p>
         </w:tc>
@@ -2510,7 +2534,25 @@
               <w:rPr>
                 <w:sz w:val="24"/>
               </w:rPr>
-              <w:t>131 hrs</w:t>
+              <w:t>13</w:t>
+            </w:r>
+            <w:r>
+              <w:rPr>
+                <w:sz w:val="24"/>
+              </w:rPr>
+              <w:t>2</w:t>
+            </w:r>
+            <w:r>
+              <w:rPr>
+                <w:sz w:val="24"/>
+              </w:rPr>
+              <w:t xml:space="preserve"> hrs</w:t>
+            </w:r>
+            <w:r>
+              <w:rPr>
+                <w:sz w:val="24"/>
+              </w:rPr>
+              <w:t xml:space="preserve"> 15 mins</w:t>
             </w:r>
             <w:r>
               <w:rPr>
@@ -2629,166 +2671,179 @@
         <w:t>:</w:t>
       </w:r>
       <w:r>
-        <w:t>00</w:t>
+        <w:t>15</w:t>
+      </w:r>
+      <w:r>
+        <w:t>PM</w:t>
+      </w:r>
+      <w:r>
+        <w:t xml:space="preserve"> (</w:t>
+      </w:r>
+      <w:r>
+        <w:t>2</w:t>
+      </w:r>
+      <w:r>
+        <w:t>hr</w:t>
+      </w:r>
+      <w:r>
+        <w:t>s 15 mins</w:t>
+      </w:r>
+      <w:r>
+        <w:t>)</w:t>
+      </w:r>
+    </w:p>
+    <w:p>
+      <w:r>
+        <w:t>Team meeting with everyone except Olivia present to discuss and create a list of activities to be completed to facilitate the change of PM and completion of the proposal.</w:t>
+      </w:r>
+      <w:r>
+        <w:t xml:space="preserve"> I gave Dave</w:t>
+      </w:r>
+      <w:r>
+        <w:t>,</w:t>
+      </w:r>
+      <w:r>
+        <w:t xml:space="preserve"> our outgoing project manager</w:t>
+      </w:r>
+      <w:r>
+        <w:t>,</w:t>
+      </w:r>
+      <w:r>
+        <w:t xml:space="preserve"> exact dates, times of meetings</w:t>
+      </w:r>
+      <w:r>
+        <w:t>,</w:t>
+      </w:r>
+      <w:r>
+        <w:t xml:space="preserve"> and topics</w:t>
+      </w:r>
+      <w:r>
+        <w:t xml:space="preserve"> for the final group log before Olivia becomes the PM. </w:t>
+      </w:r>
+      <w:r>
+        <w:t>I also audited my hours with Dave.</w:t>
+      </w:r>
+    </w:p>
+    <w:p>
+      <w:r>
+        <w:t>Tuesday. August 25</w:t>
+      </w:r>
+    </w:p>
+    <w:p>
+      <w:r>
+        <w:t>10:00-11:30</w:t>
+      </w:r>
+      <w:r>
+        <w:t>PM</w:t>
+      </w:r>
+      <w:r>
+        <w:t xml:space="preserve"> (1hr 30mins)</w:t>
+      </w:r>
+    </w:p>
+    <w:p>
+      <w:r>
+        <w:t>Team meeting with everyone present, we established the meeting, came up with some tasks and roles Dave can fit into, specifically as a test case writer, he is to do research on this</w:t>
+      </w:r>
+      <w:r>
+        <w:t xml:space="preserve"> also. We discussed the meeting happening with clement tomorrow, how we are to contact him. I described the agenda and who is heading each topic in that meeting. We complete auditing for the rest of the group logs and discuss why </w:t>
+      </w:r>
+      <w:r>
+        <w:t>Dave</w:t>
+      </w:r>
+      <w:r>
+        <w:t xml:space="preserve"> will continue maintain the group logs going forward. I pulled up the BHB proposal feedback document and systematically, with the team, crossed off everything that we have considered done. For incomplete requirements, I highlighted them and assigned a person to work on that task. We then made sure everyone knew what they were doing today.</w:t>
+      </w:r>
+    </w:p>
+    <w:p>
+      <w:r>
+        <w:t>12:15 – 2:00</w:t>
+      </w:r>
+      <w:r>
+        <w:t>PM</w:t>
+      </w:r>
+      <w:r>
+        <w:t xml:space="preserve"> (1hr, 45mins)</w:t>
+      </w:r>
+    </w:p>
+    <w:p>
+      <w:r>
+        <w:t>Debrief</w:t>
+      </w:r>
+      <w:r>
+        <w:t xml:space="preserve"> with the team on the meeting with Bryce, </w:t>
+      </w:r>
+      <w:r>
+        <w:t>assigning tasks to team</w:t>
+      </w:r>
+      <w:r>
+        <w:t xml:space="preserve"> members and discussing our interpretations of what Bryce has said.</w:t>
+      </w:r>
+    </w:p>
+    <w:p>
+      <w:pPr>
+        <w:pStyle w:val="Heading2"/>
+      </w:pPr>
+      <w:bookmarkStart w:id="3" w:name="_Toc238465154"/>
+      <w:r>
+        <w:t>Advisor Meetings</w:t>
+      </w:r>
+      <w:bookmarkEnd w:id="3"/>
+    </w:p>
+    <w:p>
+      <w:r>
+        <w:t>Monday, August 24</w:t>
+      </w:r>
+    </w:p>
+    <w:p>
+      <w:r>
+        <w:t>10:00-11:00AM</w:t>
+      </w:r>
+      <w:r>
+        <w:t xml:space="preserve"> (1hr)</w:t>
+      </w:r>
+    </w:p>
+    <w:p>
+      <w:r>
+        <w:t>Meeting with Bryce to gain further feedback about the proposal and understanding the direction of the project.</w:t>
+      </w:r>
+    </w:p>
+    <w:p>
+      <w:r>
+        <w:t>Wednesday, August 26</w:t>
+      </w:r>
+    </w:p>
+    <w:p>
+      <w:r>
+        <w:t>11:00-12:00</w:t>
+      </w:r>
+      <w:r>
+        <w:t>PM</w:t>
+      </w:r>
+      <w:r>
+        <w:t xml:space="preserve"> (1hr)</w:t>
+      </w:r>
+    </w:p>
+    <w:p>
+      <w:r>
+        <w:t>Meeting with Clement, see week 7 meeting minutes.</w:t>
+      </w:r>
+    </w:p>
+    <w:p>
+      <w:r>
+        <w:t>Friday, August 28</w:t>
+      </w:r>
+    </w:p>
+    <w:p>
+      <w:r>
+        <w:t>10</w:t>
+      </w:r>
+      <w:r>
+        <w:t>:00</w:t>
       </w:r>
       <w:r>
         <w:t>AM</w:t>
       </w:r>
       <w:r>
-        <w:t xml:space="preserve"> (1hr)</w:t>
-      </w:r>
-    </w:p>
-    <w:p>
-      <w:r>
-        <w:t>Team meeting with everyone except Olivia present to discuss and create a list of activities to be completed to facilitate the change of PM and completion of the proposal.</w:t>
-      </w:r>
-      <w:r>
-        <w:t xml:space="preserve"> I gave Dave</w:t>
-      </w:r>
-      <w:r>
-        <w:t>,</w:t>
-      </w:r>
-      <w:r>
-        <w:t xml:space="preserve"> our outgoing project manager</w:t>
-      </w:r>
-      <w:r>
-        <w:t>,</w:t>
-      </w:r>
-      <w:r>
-        <w:t xml:space="preserve"> exact dates, times of meetings</w:t>
-      </w:r>
-      <w:r>
-        <w:t>,</w:t>
-      </w:r>
-      <w:r>
-        <w:t xml:space="preserve"> and topics</w:t>
-      </w:r>
-      <w:r>
-        <w:t xml:space="preserve"> for the final group log before Olivia becomes the PM. </w:t>
-      </w:r>
-      <w:r>
-        <w:t>I also audited my hours with Dave.</w:t>
-      </w:r>
-    </w:p>
-    <w:p>
-      <w:r>
-        <w:t>Tuesday. August 25</w:t>
-      </w:r>
-    </w:p>
-    <w:p>
-      <w:r>
-        <w:t>10:00-11:30</w:t>
-      </w:r>
-      <w:r>
-        <w:t xml:space="preserve"> (1hr 30mins)</w:t>
-      </w:r>
-    </w:p>
-    <w:p>
-      <w:r>
-        <w:t xml:space="preserve">Team meeting with everyone </w:t>
-      </w:r>
-      <w:proofErr w:type="gramStart"/>
-      <w:r>
-        <w:t>present</w:t>
-      </w:r>
-      <w:proofErr w:type="gramEnd"/>
-      <w:r>
-        <w:t>, we established the meeting, came up with some tasks and roles Dave can fit into, specifically as a test case writer, he is to do research on this</w:t>
-      </w:r>
-      <w:r>
-        <w:t xml:space="preserve"> also. We discussed the meeting happening with clement tomorrow, how we are to contact him. I described the agenda and who is heading each topic in that meeting. We complete auditing for the rest of the group logs and discuss why </w:t>
-      </w:r>
-      <w:r>
-        <w:t>Dave</w:t>
-      </w:r>
-      <w:r>
-        <w:t xml:space="preserve"> will continue maintain the group logs going forward. I pulled up the BHB proposal feedback document and systematically, with the team, crossed off everything that we have considered done. For incomplete requirements, I highlighted them and assigned a person to work on that task. We then made sure everyone knew what they were doing today.</w:t>
-      </w:r>
-    </w:p>
-    <w:p>
-      <w:r>
-        <w:t>12:15 – 2:00</w:t>
-      </w:r>
-      <w:r>
-        <w:t xml:space="preserve"> PM</w:t>
-      </w:r>
-      <w:r>
-        <w:t xml:space="preserve"> (1hr, 45mins)</w:t>
-      </w:r>
-    </w:p>
-    <w:p>
-      <w:r>
-        <w:t>Debrief</w:t>
-      </w:r>
-      <w:r>
-        <w:t xml:space="preserve"> with the team on the meeting with Bryce, </w:t>
-      </w:r>
-      <w:r>
-        <w:t>assigning tasks to team</w:t>
-      </w:r>
-      <w:r>
-        <w:t xml:space="preserve"> members and discussing our interpretations of what Bryce has said.</w:t>
-      </w:r>
-    </w:p>
-    <w:p>
-      <w:pPr>
-        <w:pStyle w:val="Heading2"/>
-      </w:pPr>
-      <w:bookmarkStart w:id="3" w:name="_Toc238465154"/>
-      <w:r>
-        <w:t>Advisor Meetings</w:t>
-      </w:r>
-      <w:bookmarkEnd w:id="3"/>
-    </w:p>
-    <w:p>
-      <w:r>
-        <w:t>Monday, August 24</w:t>
-      </w:r>
-    </w:p>
-    <w:p>
-      <w:r>
-        <w:t>10:00-11:00 AM</w:t>
-      </w:r>
-      <w:r>
-        <w:t xml:space="preserve"> (1hr)</w:t>
-      </w:r>
-    </w:p>
-    <w:p>
-      <w:r>
-        <w:t>Meeting with Bryce to gain further feedback about the proposal and understanding the direction of the project.</w:t>
-      </w:r>
-    </w:p>
-    <w:p>
-      <w:r>
-        <w:t>Wednesday, August 26</w:t>
-      </w:r>
-    </w:p>
-    <w:p>
-      <w:r>
-        <w:t>11:00-12:00 (1hr)</w:t>
-      </w:r>
-    </w:p>
-    <w:p>
-      <w:r>
-        <w:t>Meeting with Clement, see week 7 meeting minutes.</w:t>
-      </w:r>
-    </w:p>
-    <w:p>
-      <w:r>
-        <w:t>Friday, August 28</w:t>
-      </w:r>
-    </w:p>
-    <w:p>
-      <w:r>
-        <w:t>10</w:t>
-      </w:r>
-      <w:r>
-        <w:t>:00</w:t>
-      </w:r>
-      <w:r>
-        <w:t>AM</w:t>
-      </w:r>
-      <w:r>
         <w:t>-12</w:t>
       </w:r>
       <w:r>
@@ -2809,23 +2864,7 @@
         <w:t>Bryce</w:t>
       </w:r>
       <w:r>
-        <w:t xml:space="preserve"> as a pdf makes me figure we need to make sure the word converts to pdf without any missing references. We addressed how we define our tools and that foremost </w:t>
-      </w:r>
-      <w:proofErr w:type="spellStart"/>
-      <w:r>
-        <w:t>cant</w:t>
-      </w:r>
-      <w:proofErr w:type="spellEnd"/>
-      <w:r>
-        <w:t xml:space="preserve"> read a </w:t>
-      </w:r>
-      <w:proofErr w:type="spellStart"/>
-      <w:r>
-        <w:t>pcap</w:t>
-      </w:r>
-      <w:proofErr w:type="spellEnd"/>
-      <w:r>
-        <w:t xml:space="preserve"> file so we cannot have 3tools x3test files = 9 tests.</w:t>
+        <w:t xml:space="preserve"> as a pdf makes me figure we need to make sure the word converts to pdf without any missing references. We addressed how we define our tools and that foremost cant read a pcap file so we cannot have 3tools x3test files = 9 tests.</w:t>
       </w:r>
     </w:p>
     <w:p>
@@ -3435,15 +3474,7 @@
     </w:p>
     <w:p>
       <w:r>
-        <w:t xml:space="preserve">I made the Windows desktop application version of Nmap scan my default gateway, and saved it as an XML, the intention of testing if models hosted via </w:t>
-      </w:r>
-      <w:proofErr w:type="spellStart"/>
-      <w:r>
-        <w:t>Ollama</w:t>
-      </w:r>
-      <w:proofErr w:type="spellEnd"/>
-      <w:r>
-        <w:t xml:space="preserve"> could read them.</w:t>
+        <w:t>I made the Windows desktop application version of Nmap scan my default gateway, and saved it as an XML, the intention of testing if models hosted via Ollama could read them.</w:t>
       </w:r>
     </w:p>
     <w:p>
@@ -3586,28 +3617,12 @@
     <w:p>
       <w:r>
         <w:lastRenderedPageBreak/>
-        <w:t xml:space="preserve">I will attempt to feed a model the Foremost output next, I’m not sure how to feed images directly into </w:t>
-      </w:r>
-      <w:proofErr w:type="spellStart"/>
-      <w:r>
-        <w:t>Ollama</w:t>
-      </w:r>
-      <w:proofErr w:type="spellEnd"/>
-      <w:r>
-        <w:t>. Documentation uses gemma4 to view images, so I will test its capacity on a single example.</w:t>
-      </w:r>
-    </w:p>
-    <w:p>
-      <w:r>
-        <w:t xml:space="preserve">I moved “His Master’s Voice” by Francis Barraud to the </w:t>
-      </w:r>
-      <w:proofErr w:type="spellStart"/>
-      <w:r>
-        <w:t>bsdh</w:t>
-      </w:r>
-      <w:proofErr w:type="spellEnd"/>
-      <w:r>
-        <w:t xml:space="preserve"> pictures directory.</w:t>
+        <w:t>I will attempt to feed a model the Foremost output next, I’m not sure how to feed images directly into Ollama. Documentation uses gemma4 to view images, so I will test its capacity on a single example.</w:t>
+      </w:r>
+    </w:p>
+    <w:p>
+      <w:r>
+        <w:t>I moved “His Master’s Voice” by Francis Barraud to the bsdh pictures directory.</w:t>
       </w:r>
     </w:p>
     <w:p>
@@ -3746,23 +3761,7 @@
         <w:t>a model</w:t>
       </w:r>
       <w:r>
-        <w:t xml:space="preserve"> optimized for video/document “intelligence workflows”. It attempted many times to read the signature text with much greater </w:t>
-      </w:r>
-      <w:proofErr w:type="gramStart"/>
-      <w:r>
-        <w:t>conviction, but</w:t>
-      </w:r>
-      <w:proofErr w:type="gramEnd"/>
-      <w:r>
-        <w:t xml:space="preserve"> still came up inconclusive thinking it may be “FRANCIS DANA”. We need to engineer our models to just give us what they DO know. Not synthesize an answer. It was funny to see it relock this one part of the prompt </w:t>
-      </w:r>
-      <w:proofErr w:type="gramStart"/>
-      <w:r>
-        <w:t>over and over</w:t>
-      </w:r>
-      <w:proofErr w:type="gramEnd"/>
-      <w:r>
-        <w:t>.</w:t>
+        <w:t xml:space="preserve"> optimized for video/document “intelligence workflows”. It attempted many times to read the signature text with much greater conviction, but still came up inconclusive thinking it may be “FRANCIS DANA”. We need to engineer our models to just give us what they DO know. Not synthesize an answer. It was funny to see it relock this one part of the prompt over and over.</w:t>
       </w:r>
     </w:p>
     <w:p>

</xml_diff>

<commit_message>
updated total hours week 7
</commit_message>
<xml_diff>
--- a/Weekly Logs/Matt/Matt Baker - Week 7 Individual Logbook.docx
+++ b/Weekly Logs/Matt/Matt Baker - Week 7 Individual Logbook.docx
@@ -2451,13 +2451,7 @@
               <w:ind w:left="0" w:firstLine="0"/>
             </w:pPr>
             <w:r>
-              <w:t>2</w:t>
-            </w:r>
-            <w:r>
-              <w:t>0</w:t>
-            </w:r>
-            <w:r>
-              <w:t>mins</w:t>
+              <w:t>29 hrs</w:t>
             </w:r>
           </w:p>
         </w:tc>

</xml_diff>